<commit_message>
docs: use approved birth date variant in SBK review
</commit_message>
<xml_diff>
--- a/backend/templates/review/sbk-dejvice-original-review.docx
+++ b/backend/templates/review/sbk-dejvice-original-review.docx
@@ -884,7 +884,7 @@
           <w:szCs w:val="20"/>
         </w:rPr>
         <w:tab/>
-        <w:t>RČ</w:t>
+        <w:t>Datum narození</w:t>
       </w:r>
       <w:r>
         <w:rPr>
@@ -917,7 +917,7 @@
           <w:szCs w:val="20"/>
           <w:highlight w:val="yellow"/>
         </w:rPr>
-        <w:t>{{buyer.birthNumber}}</w:t>
+        <w:t>{{buyer.birthDate}}</w:t>
       </w:r>
     </w:p>
     <w:p>

</xml_diff>